<commit_message>
feat: refresh contract intelligence pipeline and add new modules
</commit_message>
<xml_diff>
--- a/data/contracts/nda/NDA.docx
+++ b/data/contracts/nda/NDA.docx
@@ -174,7 +174,22 @@
     <w:p/>
     <w:p>
       <w:r>
-        <w:t>Either party may terminate this Agreement by providing thirty (30) days prior written notice.</w:t>
+        <w:t xml:space="preserve">Either party may terminate this Agreement by providing </w:t>
+      </w:r>
+      <w:r>
+        <w:t>thirty</w:t>
+      </w:r>
+      <w:r>
+        <w:t>(</w:t>
+      </w:r>
+      <w:r>
+        <w:t>3</w:t>
+      </w:r>
+      <w:r>
+        <w:t>0</w:t>
+      </w:r>
+      <w:r>
+        <w:t>) days prior written notice.</w:t>
       </w:r>
     </w:p>
     <w:p/>
@@ -217,15 +232,7 @@
     <w:p/>
     <w:p>
       <w:r>
-        <w:t xml:space="preserve">The liability of either party under this Agreement shall not exceed INR 5,00,000 except in cases involving fraud, </w:t>
-      </w:r>
-      <w:proofErr w:type="spellStart"/>
-      <w:r>
-        <w:t>willful</w:t>
-      </w:r>
-      <w:proofErr w:type="spellEnd"/>
-      <w:r>
-        <w:t xml:space="preserve"> misconduct, or breach of confidentiality obligations.</w:t>
+        <w:t>The liability of either party under this Agreement shall not exceed INR 5,00,000 except in cases involving fraud, willful misconduct, or breach of confidentiality obligations.</w:t>
       </w:r>
     </w:p>
     <w:p/>

</xml_diff>